<commit_message>
Use first-tier event for answer deadline
</commit_message>
<xml_diff>
--- a/docassemble/MAEvictionDefense/data/templates/NextSteps.docx
+++ b/docassemble/MAEvictionDefense/data/templates/NextSteps.docx
@@ -162,7 +162,7 @@
           <w:bCs/>
           <w:color w:val="1B73E8"/>
         </w:rPr>
-        <w:t>Deliver</w:t>
+        <w:t>File and deliver</w:t>
       </w:r>
     </w:p>
     <w:p>
@@ -175,15 +175,6 @@
           <w:szCs w:val="20"/>
         </w:rPr>
       </w:pPr>
-      <w:r>
-        <w:rPr>
-          <w:rFonts w:ascii="Arial Nova" w:eastAsia="Times New Roman" w:hAnsi="Arial Nova" w:cs="Arial"/>
-          <w:color w:val="00000A"/>
-          <w:sz w:val="20"/>
-          <w:szCs w:val="20"/>
-        </w:rPr>
-        <w:t>Deliver a copy of the Answer and Discovery Request to {</w:t>
-      </w:r>
       <w:r>
         <w:rPr>
           <w:rFonts w:ascii="Arial Nova" w:hAnsi="Arial Nova" w:cs="Arial"/>
@@ -194,7 +185,7 @@
           <w:lang w:eastAsia="en-US"/>
           <w14:ligatures w14:val="none"/>
         </w:rPr>
-        <w:t>% if landlord.has_attorney %}Your landlord's attorney, {{ landlords_attorney }}{% else %}Your landlord, {{ landlord }}{% endif %}.</w:t>
+        <w:t>File the Answer and Discovery Request with {{ court }}. Deliver another copy to {% if landlord.has_attorney %}your landlord's attorney, {{ landlords_attorney }}{% else %}your landlord, {{ landlord }}{% endif %}. {% if case.answer_deadline_known %}Under the current summary process rules, both must receive the forms by {{ case.answer_date }}, 3 court business days before your first-tier event.{% else %}Your exact deadline is not known without a valid first-tier event date. It is ordinarily 3 court business days before that event. File and deliver the forms as soon as possible. Do not wait for the court notice. Check the court docket or contact the clerk now to confirm the event date.{% endif %}</w:t>
       </w:r>
     </w:p>
     <w:p>
@@ -256,67 +247,7 @@
           <w:sz w:val="20"/>
           <w:szCs w:val="20"/>
         </w:rPr>
-        <w:t xml:space="preserve">Your </w:t>
-      </w:r>
-      <w:r>
-        <w:rPr>
-          <w:rFonts w:ascii="Arial Nova" w:eastAsia="Times New Roman" w:hAnsi="Arial Nova" w:cs="Arial"/>
-          <w:b/>
-          <w:bCs/>
-          <w:color w:val="00000A"/>
-          <w:sz w:val="20"/>
-          <w:szCs w:val="20"/>
-        </w:rPr>
-        <w:t>scheduled</w:t>
-      </w:r>
-      <w:r>
-        <w:rPr>
-          <w:rFonts w:ascii="Arial Nova" w:eastAsia="Times New Roman" w:hAnsi="Arial Nova" w:cs="Arial"/>
-          <w:b/>
-          <w:bCs/>
-          <w:color w:val="00000A"/>
-          <w:sz w:val="20"/>
-          <w:szCs w:val="20"/>
-        </w:rPr>
-        <w:t xml:space="preserve"> court date is</w:t>
-      </w:r>
-      <w:r>
-        <w:rPr>
-          <w:rFonts w:ascii="Arial Nova" w:eastAsia="Times New Roman" w:hAnsi="Arial Nova" w:cs="Arial"/>
-          <w:color w:val="00000A"/>
-          <w:sz w:val="20"/>
-          <w:szCs w:val="20"/>
-        </w:rPr>
-        <w:t xml:space="preserve"> </w:t>
-      </w:r>
-      <w:r>
-        <w:rPr>
-          <w:rFonts w:ascii="Arial Nova" w:eastAsia="HGPSoeiKakugothicUB" w:hAnsi="Arial Nova" w:cs="Arial"/>
-          <w:b/>
-          <w:bCs/>
-          <w:color w:val="1B81FF"/>
-          <w:sz w:val="20"/>
-          <w:szCs w:val="20"/>
-        </w:rPr>
-        <w:t>{{court_date}}</w:t>
-      </w:r>
-      <w:r>
-        <w:rPr>
-          <w:rFonts w:ascii="Arial Nova" w:eastAsia="Times New Roman" w:hAnsi="Arial Nova" w:cs="Arial"/>
-          <w:color w:val="00000A"/>
-          <w:sz w:val="20"/>
-          <w:szCs w:val="20"/>
-        </w:rPr>
-        <w:t xml:space="preserve">. </w:t>
-      </w:r>
-      <w:r>
-        <w:rPr>
-          <w:rFonts w:ascii="Arial Nova" w:eastAsia="Times New Roman" w:hAnsi="Arial Nova" w:cs="Arial"/>
-          <w:color w:val="00000A"/>
-          <w:sz w:val="20"/>
-          <w:szCs w:val="20"/>
-        </w:rPr>
-        <w:t>{% if not court_is_housing_court and transfer_to_housing_court %}</w:t>
+        <w:t>{% if case.hearing_date_assigned %}Your scheduled first court event is {{ court_date }}.{% else %}Your first court-event date is not known yet. Check the court docket or contact the clerk now, keep watching for the separate court notice, and attend every event the court assigns.{% endif %} {% if not court_is_housing_court and transfer_to_housing_court %}</w:t>
       </w:r>
     </w:p>
     <w:p>

</xml_diff>